<commit_message>
feat(arch): implement vpc, dynamodb gateway endpoint, and domain-grouped lambdas
</commit_message>
<xml_diff>
--- a/docs/notes/06-local-setup.docx
+++ b/docs/notes/06-local-setup.docx
@@ -528,21 +528,21 @@
           <w:sz w:val="22"/>
           <w:szCs w:val="22"/>
         </w:rPr>
-        <w:t xml:space="preserve">  --email ops@northbridge.edu \</w:t>
-      </w:r>
-    </w:p>
-    <w:p>
-      <w:pPr>
-        <w:spacing w:after="80" w:before="80"/>
-      </w:pPr>
-      <w:r>
-        <w:rPr>
-          <w:b w:val="false"/>
-          <w:bCs w:val="false"/>
-          <w:sz w:val="22"/>
-          <w:szCs w:val="22"/>
-        </w:rPr>
-        <w:t xml:space="preserve">  --password &lt;password from credentials doc&gt;</w:t>
+        <w:t xml:space="preserve">  -n 20</w:t>
+      </w:r>
+    </w:p>
+    <w:p>
+      <w:pPr>
+        <w:spacing w:after="80" w:before="80"/>
+      </w:pPr>
+      <w:r>
+        <w:rPr>
+          <w:b w:val="false"/>
+          <w:bCs w:val="false"/>
+          <w:sz w:val="22"/>
+          <w:szCs w:val="22"/>
+        </w:rPr>
+        <w:t xml:space="preserve"># Credentials are environment variables, not flags. Set them first (PowerShell): $env:CAMPUSPULSE_USER="ops@northbridge.edu"; $env:CAMPUSPULSE_PASSWORD="&lt;password&gt;"</w:t>
       </w:r>
     </w:p>
     <w:p/>
@@ -571,7 +571,7 @@
           <w:sz w:val="22"/>
           <w:szCs w:val="22"/>
         </w:rPr>
-        <w:t xml:space="preserve">python simulator.py --api-url ... --email ... --password ... --force-alert</w:t>
+        <w:t xml:space="preserve">python simulator.py --api-url ... --force-alert -n 1</w:t>
       </w:r>
     </w:p>
     <w:p/>
@@ -600,7 +600,7 @@
           <w:sz w:val="22"/>
           <w:szCs w:val="22"/>
         </w:rPr>
-        <w:t xml:space="preserve">python simulator.py --api-url ... --email ... --password ... --interval 2</w:t>
+        <w:t xml:space="preserve">python simulator.py --api-url ... --interval 2</w:t>
       </w:r>
     </w:p>
     <w:p/>

</xml_diff>